<commit_message>
feat: SignupFlow暗色主题 (.signup-dark CSS覆盖)
背景#111827, 卡片#1c2a3a, 输入框#1e293b
不修改JSX结构, 纯CSS覆盖

Co-Authored-By: Claude <noreply@anthropic.com>
</commit_message>
<xml_diff>
--- a/projects/contracts/LIVANTO/VerpackG_Bevollmächtigungsvertrag.docx
+++ b/projects/contracts/LIVANTO/VerpackG_Bevollmächtigungsvertrag.docx
@@ -1,42 +1,5 @@
 
-<file path=docProps\app.xml><?xml version="1.0" encoding="utf-8"?>
-<Properties xmlns="http://schemas.openxmlformats.org/officeDocument/2006/extended-properties" xmlns:vt="http://schemas.openxmlformats.org/officeDocument/2006/docPropsVTypes">
-  <Pages>12</Pages>
-  <Words>794</Words>
-  <Characters>2525</Characters>
-  <TotalTime>120</TotalTime>
-  <ScaleCrop>false</ScaleCrop>
-  <LinksUpToDate>false</LinksUpToDate>
-  <CharactersWithSpaces>2791</CharactersWithSpaces>
-  <Application>WPS Office_12.1.0.26895_F1E327BC-269C-435d-A152-05C5408002CA</Application>
-</Properties>
-</file>
-
-<file path=docProps\core.xml><?xml version="1.0" encoding="utf-8"?>
-<cp:coreProperties xmlns:cp="http://schemas.openxmlformats.org/package/2006/metadata/core-properties" xmlns:dc="http://purl.org/dc/elements/1.1/" xmlns:dcterms="http://purl.org/dc/terms/" xmlns:dcmitype="http://purl.org/dc/dcmitype/" xmlns:xsi="http://www.w3.org/2001/XMLSchema-instance">
-  <dcterms:created xsi:type="dcterms:W3CDTF">2026-06-25T19:27:00Z</dcterms:created>
-  <dc:creator>Un-named</dc:creator>
-  <cp:lastModifiedBy>嗨！</cp:lastModifiedBy>
-  <dcterms:modified xsi:type="dcterms:W3CDTF">2026-06-27T16:48:47Z</dcterms:modified>
-  <cp:revision>1</cp:revision>
-</cp:coreProperties>
-</file>
-
-<file path=docProps\custom.xml><?xml version="1.0" encoding="utf-8"?>
-<Properties xmlns="http://schemas.openxmlformats.org/officeDocument/2006/custom-properties" xmlns:vt="http://schemas.openxmlformats.org/officeDocument/2006/docPropsVTypes">
-  <property fmtid="{D5CDD505-2E9C-101B-9397-08002B2CF9AE}" pid="2" name="KSOTemplateDocerSaveRecord">
-    <vt:lpwstr>eyJoZGlkIjoiMDljYzUzMWQ4OWI0YzBkYjYzMDRhZTY5ZjZkYmFmYTgiLCJ1c2VySWQiOiIyOTg1MDY2NzAifQ==</vt:lpwstr>
-  </property>
-  <property fmtid="{D5CDD505-2E9C-101B-9397-08002B2CF9AE}" pid="3" name="KSOProductBuildVer">
-    <vt:lpwstr>2052-12.1.0.26895</vt:lpwstr>
-  </property>
-  <property fmtid="{D5CDD505-2E9C-101B-9397-08002B2CF9AE}" pid="4" name="ICV">
-    <vt:lpwstr>BA52ED5676D74E36998415CA1BF4DCA4_12</vt:lpwstr>
-  </property>
-</Properties>
-</file>
-
-<file path=word\document.xml><?xml version="1.0" encoding="utf-8"?>
+<file path=word/document.xml><?xml version="1.0" encoding="utf-8"?>
 <w:document xmlns:wpc="http://schemas.microsoft.com/office/word/2010/wordprocessingCanvas" xmlns:mc="http://schemas.openxmlformats.org/markup-compatibility/2006" xmlns:o="urn:schemas-microsoft-com:office:office" xmlns:r="http://schemas.openxmlformats.org/officeDocument/2006/relationships" xmlns:m="http://schemas.openxmlformats.org/officeDocument/2006/math" xmlns:v="urn:schemas-microsoft-com:vml" xmlns:wp14="http://schemas.microsoft.com/office/word/2010/wordprocessingDrawing" xmlns:wp="http://schemas.openxmlformats.org/drawingml/2006/wordprocessingDrawing" xmlns:w="http://schemas.openxmlformats.org/wordprocessingml/2006/main" xmlns:w14="http://schemas.microsoft.com/office/word/2010/wordml" xmlns:w10="urn:schemas-microsoft-com:office:word" xmlns:w15="http://schemas.microsoft.com/office/word/2012/wordml" xmlns:wpg="http://schemas.microsoft.com/office/word/2010/wordprocessingGroup" xmlns:wpi="http://schemas.microsoft.com/office/word/2010/wordprocessingInk" xmlns:wne="http://schemas.microsoft.com/office/word/2006/wordml" xmlns:wps="http://schemas.microsoft.com/office/word/2010/wordprocessingShape" xmlns:wpsCustomData="http://www.wps.cn/officeDocument/2013/wpsCustomData" mc:Ignorable="w14 w15 wp14">
   <w:body>
     <w:p>
@@ -713,26 +676,44 @@
               <w:bottom w:val="nil"/>
               <w:right w:val="nil"/>
             </w:tcBorders>
+            <w:shd w:val="clear"/>
             <w:tcMar>
               <w:top w:w="10" w:type="dxa"/>
               <w:left w:w="0" w:type="dxa"/>
               <w:bottom w:w="10" w:type="dxa"/>
               <w:right w:w="80" w:type="dxa"/>
             </w:tcMar>
-          </w:tcPr>
-          <w:p>
-            <w:pPr>
-              <w:spacing w:before="20" w:after="20"/>
-            </w:pPr>
-            <w:r>
-              <w:rPr>
-                <w:rFonts w:ascii="Times New Roman" w:hAnsi="Times New Roman" w:eastAsia="Times New Roman" w:cs="Times New Roman"/>
-                <w:b w:val="0"/>
-                <w:bCs w:val="0"/>
-                <w:sz w:val="21"/>
-                <w:szCs w:val="21"/>
-              </w:rPr>
-              <w:t>E-Mail: {contact_email}</w:t>
+            <w:vAlign w:val="top"/>
+          </w:tcPr>
+          <w:p>
+            <w:pPr>
+              <w:spacing w:before="20" w:after="20"/>
+              <w:rPr>
+                <w:rFonts w:ascii="Times New Roman" w:hAnsi="Times New Roman" w:eastAsia="Times New Roman" w:cs="Times New Roman"/>
+                <w:sz w:val="21"/>
+                <w:szCs w:val="21"/>
+              </w:rPr>
+            </w:pPr>
+            <w:r>
+              <w:rPr>
+                <w:rFonts w:hint="eastAsia" w:eastAsia="宋体" w:cs="Times New Roman"/>
+                <w:b w:val="0"/>
+                <w:bCs w:val="0"/>
+                <w:sz w:val="21"/>
+                <w:szCs w:val="21"/>
+                <w:lang w:val="en-US" w:eastAsia="zh-CN"/>
+              </w:rPr>
+              <w:t>G</w:t>
+            </w:r>
+            <w:r>
+              <w:rPr>
+                <w:rFonts w:ascii="Times New Roman" w:hAnsi="Times New Roman" w:eastAsia="Times New Roman" w:cs="Times New Roman"/>
+                <w:b w:val="0"/>
+                <w:bCs w:val="0"/>
+                <w:sz w:val="21"/>
+                <w:szCs w:val="21"/>
+              </w:rPr>
+              <w:t>esetzl. Vertreter: {legal_representative}</w:t>
             </w:r>
           </w:p>
         </w:tc>
@@ -745,16 +726,23 @@
               <w:bottom w:val="nil"/>
               <w:right w:val="nil"/>
             </w:tcBorders>
+            <w:shd w:val="clear"/>
             <w:tcMar>
               <w:top w:w="10" w:type="dxa"/>
               <w:left w:w="80" w:type="dxa"/>
               <w:bottom w:w="10" w:type="dxa"/>
               <w:right w:w="0" w:type="dxa"/>
             </w:tcMar>
-          </w:tcPr>
-          <w:p>
-            <w:pPr>
-              <w:spacing w:before="20" w:after="20"/>
+            <w:vAlign w:val="top"/>
+          </w:tcPr>
+          <w:p>
+            <w:pPr>
+              <w:spacing w:before="20" w:after="20"/>
+              <w:rPr>
+                <w:rFonts w:ascii="Times New Roman" w:hAnsi="Times New Roman" w:eastAsia="Times New Roman" w:cs="Times New Roman"/>
+                <w:sz w:val="21"/>
+                <w:szCs w:val="21"/>
+              </w:rPr>
             </w:pPr>
             <w:r>
               <w:rPr>
@@ -764,7 +752,7 @@
                 <w:sz w:val="21"/>
                 <w:szCs w:val="21"/>
               </w:rPr>
-              <w:t>电子邮箱：{contact_email}</w:t>
+              <w:t>法定代表人：{legal_representative}</w:t>
             </w:r>
           </w:p>
         </w:tc>
@@ -928,91 +916,10 @@
                 <w:sz w:val="21"/>
                 <w:szCs w:val="21"/>
               </w:rPr>
-              <w:t>微信：{wechat_id}</w:t>
-            </w:r>
-          </w:p>
-        </w:tc>
-      </w:tr>
-      <w:tr>
-        <w:tblPrEx>
-          <w:tblBorders>
-            <w:top w:val="single" w:color="auto" w:sz="4" w:space="0"/>
-            <w:left w:val="single" w:color="auto" w:sz="4" w:space="0"/>
-            <w:bottom w:val="single" w:color="auto" w:sz="4" w:space="0"/>
-            <w:right w:val="single" w:color="auto" w:sz="4" w:space="0"/>
-            <w:insideH w:val="single" w:color="auto" w:sz="4" w:space="0"/>
-            <w:insideV w:val="single" w:color="auto" w:sz="4" w:space="0"/>
-          </w:tblBorders>
-          <w:tblCellMar>
-            <w:top w:w="0" w:type="dxa"/>
-            <w:left w:w="10" w:type="dxa"/>
-            <w:bottom w:w="0" w:type="dxa"/>
-            <w:right w:w="10" w:type="dxa"/>
-          </w:tblCellMar>
-        </w:tblPrEx>
-        <w:tc>
-          <w:tcPr>
-            <w:tcW w:w="5018" w:type="dxa"/>
-            <w:tcBorders>
-              <w:top w:val="nil"/>
-              <w:left w:val="nil"/>
-              <w:bottom w:val="nil"/>
-              <w:right w:val="nil"/>
-            </w:tcBorders>
-            <w:tcMar>
-              <w:top w:w="10" w:type="dxa"/>
-              <w:left w:w="0" w:type="dxa"/>
-              <w:bottom w:w="10" w:type="dxa"/>
-              <w:right w:w="80" w:type="dxa"/>
-            </w:tcMar>
-          </w:tcPr>
-          <w:p>
-            <w:pPr>
-              <w:spacing w:before="20" w:after="20"/>
-            </w:pPr>
-            <w:r>
-              <w:rPr>
-                <w:rFonts w:hint="eastAsia" w:eastAsia="宋体" w:cs="Times New Roman"/>
-                <w:b w:val="0"/>
-                <w:bCs w:val="0"/>
-                <w:sz w:val="21"/>
-                <w:szCs w:val="21"/>
-                <w:lang w:val="en-US" w:eastAsia="zh-CN"/>
-              </w:rPr>
-              <w:t>G</w:t>
-            </w:r>
-            <w:r>
-              <w:rPr>
-                <w:rFonts w:ascii="Times New Roman" w:hAnsi="Times New Roman" w:eastAsia="Times New Roman" w:cs="Times New Roman"/>
-                <w:b w:val="0"/>
-                <w:bCs w:val="0"/>
-                <w:sz w:val="21"/>
-                <w:szCs w:val="21"/>
-              </w:rPr>
-              <w:t>esetzl. Vertreter: {legal_representative}</w:t>
-            </w:r>
-          </w:p>
-        </w:tc>
-        <w:tc>
-          <w:tcPr>
-            <w:tcW w:w="4687" w:type="dxa"/>
-            <w:tcBorders>
-              <w:top w:val="nil"/>
-              <w:left w:val="nil"/>
-              <w:bottom w:val="nil"/>
-              <w:right w:val="nil"/>
-            </w:tcBorders>
-            <w:tcMar>
-              <w:top w:w="10" w:type="dxa"/>
-              <w:left w:w="80" w:type="dxa"/>
-              <w:bottom w:w="10" w:type="dxa"/>
-              <w:right w:w="0" w:type="dxa"/>
-            </w:tcMar>
-          </w:tcPr>
-          <w:p>
-            <w:pPr>
-              <w:spacing w:before="20" w:after="20"/>
-            </w:pPr>
+              <w:t>微信：{wec</w:t>
+            </w:r>
+            <w:bookmarkStart w:id="0" w:name="_GoBack"/>
+            <w:bookmarkEnd w:id="0"/>
             <w:r>
               <w:rPr>
                 <w:rFonts w:ascii="宋体" w:hAnsi="宋体" w:eastAsia="宋体" w:cs="宋体"/>
@@ -1021,7 +928,7 @@
                 <w:sz w:val="21"/>
                 <w:szCs w:val="21"/>
               </w:rPr>
-              <w:t>法定代表人：{legal_representative}</w:t>
+              <w:t>hat_id}</w:t>
             </w:r>
           </w:p>
         </w:tc>
@@ -1704,12 +1611,6 @@
             <w:insideH w:val="single" w:color="auto" w:sz="4" w:space="0"/>
             <w:insideV w:val="single" w:color="auto" w:sz="4" w:space="0"/>
           </w:tblBorders>
-          <w:tblCellMar>
-            <w:top w:w="0" w:type="dxa"/>
-            <w:left w:w="10" w:type="dxa"/>
-            <w:bottom w:w="0" w:type="dxa"/>
-            <w:right w:w="10" w:type="dxa"/>
-          </w:tblCellMar>
         </w:tblPrEx>
         <w:tc>
           <w:tcPr>
@@ -8141,6 +8042,12 @@
             <w:insideH w:val="single" w:color="auto" w:sz="4" w:space="0"/>
             <w:insideV w:val="single" w:color="auto" w:sz="4" w:space="0"/>
           </w:tblBorders>
+          <w:tblCellMar>
+            <w:top w:w="0" w:type="dxa"/>
+            <w:left w:w="10" w:type="dxa"/>
+            <w:bottom w:w="0" w:type="dxa"/>
+            <w:right w:w="10" w:type="dxa"/>
+          </w:tblCellMar>
         </w:tblPrEx>
         <w:tc>
           <w:tcPr>
@@ -11209,6 +11116,12 @@
             <w:insideH w:val="single" w:color="auto" w:sz="4" w:space="0"/>
             <w:insideV w:val="single" w:color="auto" w:sz="4" w:space="0"/>
           </w:tblBorders>
+          <w:tblCellMar>
+            <w:top w:w="0" w:type="dxa"/>
+            <w:left w:w="10" w:type="dxa"/>
+            <w:bottom w:w="0" w:type="dxa"/>
+            <w:right w:w="10" w:type="dxa"/>
+          </w:tblCellMar>
         </w:tblPrEx>
         <w:tc>
           <w:tcPr>
@@ -11285,12 +11198,6 @@
             <w:insideH w:val="single" w:color="auto" w:sz="4" w:space="0"/>
             <w:insideV w:val="single" w:color="auto" w:sz="4" w:space="0"/>
           </w:tblBorders>
-          <w:tblCellMar>
-            <w:top w:w="0" w:type="dxa"/>
-            <w:left w:w="10" w:type="dxa"/>
-            <w:bottom w:w="0" w:type="dxa"/>
-            <w:right w:w="10" w:type="dxa"/>
-          </w:tblCellMar>
         </w:tblPrEx>
         <w:tc>
           <w:tcPr>
@@ -11398,12 +11305,6 @@
             <w:insideH w:val="single" w:color="auto" w:sz="4" w:space="0"/>
             <w:insideV w:val="single" w:color="auto" w:sz="4" w:space="0"/>
           </w:tblBorders>
-          <w:tblCellMar>
-            <w:top w:w="0" w:type="dxa"/>
-            <w:left w:w="10" w:type="dxa"/>
-            <w:bottom w:w="0" w:type="dxa"/>
-            <w:right w:w="10" w:type="dxa"/>
-          </w:tblCellMar>
         </w:tblPrEx>
         <w:tc>
           <w:tcPr>
@@ -11566,68 +11467,7 @@
 </w:document>
 </file>
 
-<file path=word\fontTable.xml><?xml version="1.0" encoding="utf-8"?>
-<w:fonts xmlns:mc="http://schemas.openxmlformats.org/markup-compatibility/2006" xmlns:r="http://schemas.openxmlformats.org/officeDocument/2006/relationships" xmlns:w="http://schemas.openxmlformats.org/wordprocessingml/2006/main" xmlns:w14="http://schemas.microsoft.com/office/word/2010/wordml" mc:Ignorable="w14">
-  <w:font w:name="Times New Roman">
-    <w:panose1 w:val="02020603050405020304"/>
-    <w:charset w:val="86"/>
-    <w:family w:val="auto"/>
-    <w:pitch w:val="default"/>
-    <w:sig w:usb0="E0002EFF" w:usb1="C000785B" w:usb2="00000009" w:usb3="00000000" w:csb0="400001FF" w:csb1="FFFF0000"/>
-  </w:font>
-  <w:font w:name="宋体">
-    <w:panose1 w:val="02010600030101010101"/>
-    <w:charset w:val="86"/>
-    <w:family w:val="auto"/>
-    <w:pitch w:val="default"/>
-    <w:sig w:usb0="00000203" w:usb1="288F0000" w:usb2="00000006" w:usb3="00000000" w:csb0="00040001" w:csb1="00000000"/>
-  </w:font>
-  <w:font w:name="Wingdings">
-    <w:panose1 w:val="05000000000000000000"/>
-    <w:charset w:val="02"/>
-    <w:family w:val="auto"/>
-    <w:pitch w:val="default"/>
-    <w:sig w:usb0="00000000" w:usb1="00000000" w:usb2="00000000" w:usb3="00000000" w:csb0="80000000" w:csb1="00000000"/>
-  </w:font>
-  <w:font w:name="Arial">
-    <w:panose1 w:val="020B0604020202020204"/>
-    <w:charset w:val="01"/>
-    <w:family w:val="swiss"/>
-    <w:pitch w:val="default"/>
-    <w:sig w:usb0="E0002EFF" w:usb1="C000785B" w:usb2="00000009" w:usb3="00000000" w:csb0="400001FF" w:csb1="FFFF0000"/>
-  </w:font>
-  <w:font w:name="黑体">
-    <w:panose1 w:val="02010609060101010101"/>
-    <w:charset w:val="86"/>
-    <w:family w:val="auto"/>
-    <w:pitch w:val="default"/>
-    <w:sig w:usb0="800002BF" w:usb1="38CF7CFA" w:usb2="00000016" w:usb3="00000000" w:csb0="00040001" w:csb1="00000000"/>
-  </w:font>
-  <w:font w:name="Courier New">
-    <w:panose1 w:val="02070309020205020404"/>
-    <w:charset w:val="01"/>
-    <w:family w:val="modern"/>
-    <w:pitch w:val="default"/>
-    <w:sig w:usb0="E0002EFF" w:usb1="C0007843" w:usb2="00000009" w:usb3="00000000" w:csb0="400001FF" w:csb1="FFFF0000"/>
-  </w:font>
-  <w:font w:name="Symbol">
-    <w:panose1 w:val="05050102010706020507"/>
-    <w:charset w:val="02"/>
-    <w:family w:val="roman"/>
-    <w:pitch w:val="default"/>
-    <w:sig w:usb0="00000000" w:usb1="00000000" w:usb2="00000000" w:usb3="00000000" w:csb0="80000000" w:csb1="00000000"/>
-  </w:font>
-  <w:font w:name="Calibri">
-    <w:panose1 w:val="020F0502020204030204"/>
-    <w:charset w:val="00"/>
-    <w:family w:val="swiss"/>
-    <w:pitch w:val="default"/>
-    <w:sig w:usb0="E4002EFF" w:usb1="C200247B" w:usb2="00000009" w:usb3="00000000" w:csb0="200001FF" w:csb1="00000000"/>
-  </w:font>
-</w:fonts>
-</file>
-
-<file path=word\footer1.xml><?xml version="1.0" encoding="utf-8"?>
+<file path=word/footer1.xml><?xml version="1.0" encoding="utf-8"?>
 <w:ftr xmlns:wpc="http://schemas.microsoft.com/office/word/2010/wordprocessingCanvas" xmlns:mc="http://schemas.openxmlformats.org/markup-compatibility/2006" xmlns:o="urn:schemas-microsoft-com:office:office" xmlns:r="http://schemas.openxmlformats.org/officeDocument/2006/relationships" xmlns:m="http://schemas.openxmlformats.org/officeDocument/2006/math" xmlns:v="urn:schemas-microsoft-com:vml" xmlns:wp14="http://schemas.microsoft.com/office/word/2010/wordprocessingDrawing" xmlns:wp="http://schemas.openxmlformats.org/drawingml/2006/wordprocessingDrawing" xmlns:w10="urn:schemas-microsoft-com:office:word" xmlns:w="http://schemas.openxmlformats.org/wordprocessingml/2006/main" xmlns:w14="http://schemas.microsoft.com/office/word/2010/wordml" xmlns:w15="http://schemas.microsoft.com/office/word/2012/wordml" xmlns:wpg="http://schemas.microsoft.com/office/word/2010/wordprocessingGroup" xmlns:wpi="http://schemas.microsoft.com/office/word/2010/wordprocessingInk" xmlns:wne="http://schemas.microsoft.com/office/word/2006/wordml" xmlns:wps="http://schemas.microsoft.com/office/word/2010/wordprocessingShape" xmlns:wpsCustomData="http://www.wps.cn/officeDocument/2013/wpsCustomData" mc:Ignorable="w14 w15 wp14">
   <w:p>
     <w:pPr>
@@ -11703,7 +11543,7 @@
 </w:ftr>
 </file>
 
-<file path=word\header1.xml><?xml version="1.0" encoding="utf-8"?>
+<file path=word/header1.xml><?xml version="1.0" encoding="utf-8"?>
 <w:hdr xmlns:wpc="http://schemas.microsoft.com/office/word/2010/wordprocessingCanvas" xmlns:mc="http://schemas.openxmlformats.org/markup-compatibility/2006" xmlns:o="urn:schemas-microsoft-com:office:office" xmlns:r="http://schemas.openxmlformats.org/officeDocument/2006/relationships" xmlns:m="http://schemas.openxmlformats.org/officeDocument/2006/math" xmlns:v="urn:schemas-microsoft-com:vml" xmlns:wp14="http://schemas.microsoft.com/office/word/2010/wordprocessingDrawing" xmlns:wp="http://schemas.openxmlformats.org/drawingml/2006/wordprocessingDrawing" xmlns:w10="urn:schemas-microsoft-com:office:word" xmlns:w="http://schemas.openxmlformats.org/wordprocessingml/2006/main" xmlns:w14="http://schemas.microsoft.com/office/word/2010/wordml" xmlns:w15="http://schemas.microsoft.com/office/word/2012/wordml" xmlns:wpg="http://schemas.microsoft.com/office/word/2010/wordprocessingGroup" xmlns:wpi="http://schemas.microsoft.com/office/word/2010/wordprocessingInk" xmlns:wne="http://schemas.microsoft.com/office/word/2006/wordml" xmlns:wps="http://schemas.microsoft.com/office/word/2010/wordprocessingShape" xmlns:wpsCustomData="http://www.wps.cn/officeDocument/2013/wpsCustomData" mc:Ignorable="w14 w15 wp14">
   <w:p>
     <w:pPr>
@@ -11743,7 +11583,7 @@
 </w:hdr>
 </file>
 
-<file path=word\numbering.xml><?xml version="1.0" encoding="utf-8"?>
+<file path=word/numbering.xml><?xml version="1.0" encoding="utf-8"?>
 <w:numbering xmlns:wpc="http://schemas.microsoft.com/office/word/2010/wordprocessingCanvas" xmlns:mc="http://schemas.openxmlformats.org/markup-compatibility/2006" xmlns:o="urn:schemas-microsoft-com:office:office" xmlns:r="http://schemas.openxmlformats.org/officeDocument/2006/relationships" xmlns:m="http://schemas.openxmlformats.org/officeDocument/2006/math" xmlns:v="urn:schemas-microsoft-com:vml" xmlns:wp14="http://schemas.microsoft.com/office/word/2010/wordprocessingDrawing" xmlns:wp="http://schemas.openxmlformats.org/drawingml/2006/wordprocessingDrawing" xmlns:w10="urn:schemas-microsoft-com:office:word" xmlns:w="http://schemas.openxmlformats.org/wordprocessingml/2006/main" xmlns:w14="http://schemas.microsoft.com/office/word/2010/wordml" xmlns:wpg="http://schemas.microsoft.com/office/word/2010/wordprocessingGroup" xmlns:wpi="http://schemas.microsoft.com/office/word/2010/wordprocessingInk" xmlns:wne="http://schemas.microsoft.com/office/word/2006/wordml" xmlns:wps="http://schemas.microsoft.com/office/word/2010/wordprocessingShape" xmlns:wpsCustomData="http://www.wps.cn/officeDocument/2013/wpsCustomData" mc:Ignorable="w14 wp14">
   <w:abstractNum w:abstractNumId="0">
     <w:nsid w:val="32B3AA26"/>
@@ -11763,54 +11603,7 @@
 </w:numbering>
 </file>
 
-<file path=word\settings.xml><?xml version="1.0" encoding="utf-8"?>
-<w:settings xmlns:mc="http://schemas.openxmlformats.org/markup-compatibility/2006" xmlns:o="urn:schemas-microsoft-com:office:office" xmlns:r="http://schemas.openxmlformats.org/officeDocument/2006/relationships" xmlns:m="http://schemas.openxmlformats.org/officeDocument/2006/math" xmlns:v="urn:schemas-microsoft-com:vml" xmlns:w10="urn:schemas-microsoft-com:office:word" xmlns:w="http://schemas.openxmlformats.org/wordprocessingml/2006/main" xmlns:w14="http://schemas.microsoft.com/office/word/2010/wordml" xmlns:sl="http://schemas.openxmlformats.org/schemaLibrary/2006/main" xmlns:wpsCustomData="http://www.wps.cn/officeDocument/2013/wpsCustomData" mc:Ignorable="w14">
-  <w:zoom w:percent="112"/>
-  <w:displayBackgroundShape w:val="1"/>
-  <w:bordersDoNotSurroundHeader w:val="0"/>
-  <w:bordersDoNotSurroundFooter w:val="0"/>
-  <w:documentProtection w:enforcement="0"/>
-  <w:displayHorizontalDrawingGridEvery w:val="1"/>
-  <w:displayVerticalDrawingGridEvery w:val="1"/>
-  <w:noPunctuationKerning w:val="1"/>
-  <w:compat>
-    <w:doNotExpandShiftReturn/>
-    <w:doNotWrapTextWithPunct/>
-    <w:doNotUseEastAsianBreakRules/>
-    <w:useFELayout/>
-    <w:compatSetting w:name="compatibilityMode" w:uri="http://schemas.microsoft.com/office/word" w:val="15"/>
-  </w:compat>
-  <w:rsids>
-    <w:rsidRoot w:val="00000000"/>
-    <w:rsid w:val="218652D1"/>
-    <w:rsid w:val="46F3234B"/>
-    <w:rsid w:val="48F843CF"/>
-    <w:rsid w:val="613268A2"/>
-    <w:rsid w:val="6C871509"/>
-  </w:rsids>
-  <m:mathPr>
-    <m:brkBin m:val="before"/>
-    <m:brkBinSub m:val="--"/>
-    <m:smallFrac m:val="0"/>
-    <m:dispDef/>
-    <m:lMargin m:val="0"/>
-    <m:rMargin m:val="0"/>
-    <m:defJc m:val="centerGroup"/>
-    <m:wrapIndent m:val="1440"/>
-    <m:intLim m:val="subSup"/>
-    <m:naryLim m:val="undOvr"/>
-  </m:mathPr>
-  <w:themeFontLang w:val="en-US" w:eastAsia="zh-CN"/>
-  <w:clrSchemeMapping w:bg1="light1" w:t1="dark1" w:bg2="light2" w:t2="dark2" w:accent1="accent1" w:accent2="accent2" w:accent3="accent3" w:accent4="accent4" w:accent5="accent5" w:accent6="accent6" w:hyperlink="hyperlink" w:followedHyperlink="followedHyperlink"/>
-  <mc:AlternateContent>
-    <mc:Choice Requires="wpsCustomData">
-      <wpsCustomData:typoFeatureVersion val="1"/>
-    </mc:Choice>
-  </mc:AlternateContent>
-</w:settings>
-</file>
-
-<file path=word\styles.xml><?xml version="1.0" encoding="utf-8"?>
+<file path=word/styles.xml><?xml version="1.0" encoding="utf-8"?>
 <w:styles xmlns:mc="http://schemas.openxmlformats.org/markup-compatibility/2006" xmlns:o="urn:schemas-microsoft-com:office:office" xmlns:r="http://schemas.openxmlformats.org/officeDocument/2006/relationships" xmlns:m="http://schemas.openxmlformats.org/officeDocument/2006/math" xmlns:v="urn:schemas-microsoft-com:vml" xmlns:w="http://schemas.openxmlformats.org/wordprocessingml/2006/main" xmlns:w14="http://schemas.microsoft.com/office/word/2010/wordml" xmlns:w10="urn:schemas-microsoft-com:office:word" xmlns:sl="http://schemas.openxmlformats.org/schemaLibrary/2006/main" xmlns:wpsCustomData="http://www.wps.cn/officeDocument/2013/wpsCustomData" mc:Ignorable="w14">
   <w:docDefaults>
     <w:rPrDefault>
@@ -11863,7 +11656,7 @@
     <w:lsdException w:unhideWhenUsed="0" w:uiPriority="0" w:semiHidden="0" w:name="annotation reference"/>
     <w:lsdException w:unhideWhenUsed="0" w:uiPriority="0" w:semiHidden="0" w:name="line number"/>
     <w:lsdException w:unhideWhenUsed="0" w:uiPriority="0" w:semiHidden="0" w:name="page number"/>
-    <w:lsdException w:uiPriority="99" w:name="endnote reference"/>
+    <w:lsdException w:qFormat="1" w:uiPriority="99" w:name="endnote reference"/>
     <w:lsdException w:uiPriority="99" w:name="endnote text"/>
     <w:lsdException w:unhideWhenUsed="0" w:uiPriority="0" w:semiHidden="0" w:name="table of authorities"/>
     <w:lsdException w:unhideWhenUsed="0" w:uiPriority="0" w:semiHidden="0" w:name="macro"/>
@@ -11920,7 +11713,7 @@
     <w:lsdException w:unhideWhenUsed="0" w:uiPriority="0" w:semiHidden="0" w:name="HTML Code"/>
     <w:lsdException w:unhideWhenUsed="0" w:uiPriority="0" w:semiHidden="0" w:name="HTML Definition"/>
     <w:lsdException w:unhideWhenUsed="0" w:uiPriority="0" w:semiHidden="0" w:name="HTML Keyboard"/>
-    <w:lsdException w:unhideWhenUsed="0" w:uiPriority="0" w:semiHidden="0" w:name="HTML Preformatted"/>
+    <w:lsdException w:qFormat="1" w:unhideWhenUsed="0" w:uiPriority="0" w:semiHidden="0" w:name="HTML Preformatted"/>
     <w:lsdException w:unhideWhenUsed="0" w:uiPriority="0" w:semiHidden="0" w:name="HTML Sample"/>
     <w:lsdException w:unhideWhenUsed="0" w:uiPriority="0" w:semiHidden="0" w:name="HTML Typewriter"/>
     <w:lsdException w:unhideWhenUsed="0" w:uiPriority="0" w:semiHidden="0" w:name="HTML Variable"/>
@@ -12210,6 +12003,7 @@
   <w:style w:type="paragraph" w:styleId="10">
     <w:name w:val="HTML Preformatted"/>
     <w:basedOn w:val="1"/>
+    <w:qFormat/>
     <w:uiPriority w:val="0"/>
     <w:pPr>
       <w:tabs>
@@ -12254,6 +12048,7 @@
     <w:name w:val="endnote reference"/>
     <w:semiHidden/>
     <w:unhideWhenUsed/>
+    <w:qFormat/>
     <w:uiPriority w:val="99"/>
     <w:rPr>
       <w:vertAlign w:val="superscript"/>
@@ -12312,7 +12107,7 @@
 </w:styles>
 </file>
 
-<file path=word\theme\theme1.xml><?xml version="1.0" encoding="utf-8"?>
+<file path=word/theme/theme1.xml><?xml version="1.0" encoding="utf-8"?>
 <a:theme xmlns:a="http://schemas.openxmlformats.org/drawingml/2006/main" name="Office">
   <a:themeElements>
     <a:clrScheme name="Office">

</xml_diff>

<commit_message>
feat: Anlage B数据填入表格(单列), docxtemplater渲染成功
</commit_message>
<xml_diff>
--- a/projects/contracts/LIVANTO/VerpackG_Bevollmächtigungsvertrag.docx
+++ b/projects/contracts/LIVANTO/VerpackG_Bevollmächtigungsvertrag.docx
@@ -9162,532 +9162,7 @@
                 <w:sz w:val="18"/>
                 <w:szCs w:val="18"/>
               </w:rPr>
-              <w:t>Glas / 玻璃</w:t>
-            </w:r>
-          </w:p>
-        </w:tc>
-        <w:tc>
-          <w:tcPr>
-            <w:tcW w:w="1000" w:type="dxa"/>
-            <w:tcMar>
-              <w:top w:w="30" w:type="dxa"/>
-              <w:left w:w="50" w:type="dxa"/>
-              <w:bottom w:w="30" w:type="dxa"/>
-              <w:right w:w="50" w:type="dxa"/>
-            </w:tcMar>
-          </w:tcPr>
-          <w:p/>
-        </w:tc>
-        <w:tc>
-          <w:tcPr>
-            <w:tcW w:w="2200" w:type="dxa"/>
-            <w:tcMar>
-              <w:top w:w="30" w:type="dxa"/>
-              <w:left w:w="50" w:type="dxa"/>
-              <w:bottom w:w="30" w:type="dxa"/>
-              <w:right w:w="50" w:type="dxa"/>
-            </w:tcMar>
-          </w:tcPr>
-          <w:p/>
-        </w:tc>
-        <w:tc>
-          <w:tcPr>
-            <w:tcW w:w="3955" w:type="dxa"/>
-            <w:tcMar>
-              <w:top w:w="30" w:type="dxa"/>
-              <w:left w:w="50" w:type="dxa"/>
-              <w:bottom w:w="30" w:type="dxa"/>
-              <w:right w:w="50" w:type="dxa"/>
-            </w:tcMar>
-          </w:tcPr>
-          <w:p/>
-        </w:tc>
-      </w:tr>
-      <w:tr>
-        <w:tblPrEx>
-          <w:tblBorders>
-            <w:top w:val="single" w:color="auto" w:sz="4" w:space="0"/>
-            <w:left w:val="single" w:color="auto" w:sz="4" w:space="0"/>
-            <w:bottom w:val="single" w:color="auto" w:sz="4" w:space="0"/>
-            <w:right w:val="single" w:color="auto" w:sz="4" w:space="0"/>
-            <w:insideH w:val="single" w:color="auto" w:sz="4" w:space="0"/>
-            <w:insideV w:val="single" w:color="auto" w:sz="4" w:space="0"/>
-          </w:tblBorders>
-          <w:tblCellMar>
-            <w:top w:w="0" w:type="dxa"/>
-            <w:left w:w="10" w:type="dxa"/>
-            <w:bottom w:w="0" w:type="dxa"/>
-            <w:right w:w="10" w:type="dxa"/>
-          </w:tblCellMar>
-        </w:tblPrEx>
-        <w:tc>
-          <w:tcPr>
-            <w:tcW w:w="2600" w:type="dxa"/>
-            <w:tcMar>
-              <w:top w:w="30" w:type="dxa"/>
-              <w:left w:w="50" w:type="dxa"/>
-              <w:bottom w:w="30" w:type="dxa"/>
-              <w:right w:w="50" w:type="dxa"/>
-            </w:tcMar>
-          </w:tcPr>
-          <w:p>
-            <w:r>
-              <w:rPr>
-                <w:rFonts w:ascii="Times New Roman" w:hAnsi="Times New Roman" w:eastAsia="Times New Roman" w:cs="Times New Roman"/>
-                <w:sz w:val="18"/>
-                <w:szCs w:val="18"/>
-              </w:rPr>
-              <w:t>Papier/Pappe/Karton / 纸/纸板/纸箱</w:t>
-            </w:r>
-          </w:p>
-        </w:tc>
-        <w:tc>
-          <w:tcPr>
-            <w:tcW w:w="1000" w:type="dxa"/>
-            <w:tcMar>
-              <w:top w:w="30" w:type="dxa"/>
-              <w:left w:w="50" w:type="dxa"/>
-              <w:bottom w:w="30" w:type="dxa"/>
-              <w:right w:w="50" w:type="dxa"/>
-            </w:tcMar>
-          </w:tcPr>
-          <w:p/>
-        </w:tc>
-        <w:tc>
-          <w:tcPr>
-            <w:tcW w:w="2200" w:type="dxa"/>
-            <w:tcMar>
-              <w:top w:w="30" w:type="dxa"/>
-              <w:left w:w="50" w:type="dxa"/>
-              <w:bottom w:w="30" w:type="dxa"/>
-              <w:right w:w="50" w:type="dxa"/>
-            </w:tcMar>
-          </w:tcPr>
-          <w:p/>
-        </w:tc>
-        <w:tc>
-          <w:tcPr>
-            <w:tcW w:w="3955" w:type="dxa"/>
-            <w:tcMar>
-              <w:top w:w="30" w:type="dxa"/>
-              <w:left w:w="50" w:type="dxa"/>
-              <w:bottom w:w="30" w:type="dxa"/>
-              <w:right w:w="50" w:type="dxa"/>
-            </w:tcMar>
-          </w:tcPr>
-          <w:p/>
-        </w:tc>
-      </w:tr>
-      <w:tr>
-        <w:tblPrEx>
-          <w:tblBorders>
-            <w:top w:val="single" w:color="auto" w:sz="4" w:space="0"/>
-            <w:left w:val="single" w:color="auto" w:sz="4" w:space="0"/>
-            <w:bottom w:val="single" w:color="auto" w:sz="4" w:space="0"/>
-            <w:right w:val="single" w:color="auto" w:sz="4" w:space="0"/>
-            <w:insideH w:val="single" w:color="auto" w:sz="4" w:space="0"/>
-            <w:insideV w:val="single" w:color="auto" w:sz="4" w:space="0"/>
-          </w:tblBorders>
-          <w:tblCellMar>
-            <w:top w:w="0" w:type="dxa"/>
-            <w:left w:w="10" w:type="dxa"/>
-            <w:bottom w:w="0" w:type="dxa"/>
-            <w:right w:w="10" w:type="dxa"/>
-          </w:tblCellMar>
-        </w:tblPrEx>
-        <w:tc>
-          <w:tcPr>
-            <w:tcW w:w="2600" w:type="dxa"/>
-            <w:tcMar>
-              <w:top w:w="30" w:type="dxa"/>
-              <w:left w:w="50" w:type="dxa"/>
-              <w:bottom w:w="30" w:type="dxa"/>
-              <w:right w:w="50" w:type="dxa"/>
-            </w:tcMar>
-          </w:tcPr>
-          <w:p>
-            <w:r>
-              <w:rPr>
-                <w:rFonts w:ascii="Times New Roman" w:hAnsi="Times New Roman" w:eastAsia="Times New Roman" w:cs="Times New Roman"/>
-                <w:sz w:val="18"/>
-                <w:szCs w:val="18"/>
-              </w:rPr>
-              <w:t>Eisenmetalle / 黑色金属</w:t>
-            </w:r>
-          </w:p>
-        </w:tc>
-        <w:tc>
-          <w:tcPr>
-            <w:tcW w:w="1000" w:type="dxa"/>
-            <w:tcMar>
-              <w:top w:w="30" w:type="dxa"/>
-              <w:left w:w="50" w:type="dxa"/>
-              <w:bottom w:w="30" w:type="dxa"/>
-              <w:right w:w="50" w:type="dxa"/>
-            </w:tcMar>
-          </w:tcPr>
-          <w:p/>
-        </w:tc>
-        <w:tc>
-          <w:tcPr>
-            <w:tcW w:w="2200" w:type="dxa"/>
-            <w:tcMar>
-              <w:top w:w="30" w:type="dxa"/>
-              <w:left w:w="50" w:type="dxa"/>
-              <w:bottom w:w="30" w:type="dxa"/>
-              <w:right w:w="50" w:type="dxa"/>
-            </w:tcMar>
-          </w:tcPr>
-          <w:p/>
-        </w:tc>
-        <w:tc>
-          <w:tcPr>
-            <w:tcW w:w="3955" w:type="dxa"/>
-            <w:tcMar>
-              <w:top w:w="30" w:type="dxa"/>
-              <w:left w:w="50" w:type="dxa"/>
-              <w:bottom w:w="30" w:type="dxa"/>
-              <w:right w:w="50" w:type="dxa"/>
-            </w:tcMar>
-          </w:tcPr>
-          <w:p/>
-        </w:tc>
-      </w:tr>
-      <w:tr>
-        <w:tblPrEx>
-          <w:tblBorders>
-            <w:top w:val="single" w:color="auto" w:sz="4" w:space="0"/>
-            <w:left w:val="single" w:color="auto" w:sz="4" w:space="0"/>
-            <w:bottom w:val="single" w:color="auto" w:sz="4" w:space="0"/>
-            <w:right w:val="single" w:color="auto" w:sz="4" w:space="0"/>
-            <w:insideH w:val="single" w:color="auto" w:sz="4" w:space="0"/>
-            <w:insideV w:val="single" w:color="auto" w:sz="4" w:space="0"/>
-          </w:tblBorders>
-          <w:tblCellMar>
-            <w:top w:w="0" w:type="dxa"/>
-            <w:left w:w="10" w:type="dxa"/>
-            <w:bottom w:w="0" w:type="dxa"/>
-            <w:right w:w="10" w:type="dxa"/>
-          </w:tblCellMar>
-        </w:tblPrEx>
-        <w:tc>
-          <w:tcPr>
-            <w:tcW w:w="2600" w:type="dxa"/>
-            <w:tcMar>
-              <w:top w:w="30" w:type="dxa"/>
-              <w:left w:w="50" w:type="dxa"/>
-              <w:bottom w:w="30" w:type="dxa"/>
-              <w:right w:w="50" w:type="dxa"/>
-            </w:tcMar>
-          </w:tcPr>
-          <w:p>
-            <w:r>
-              <w:rPr>
-                <w:rFonts w:ascii="Times New Roman" w:hAnsi="Times New Roman" w:eastAsia="Times New Roman" w:cs="Times New Roman"/>
-                <w:sz w:val="18"/>
-                <w:szCs w:val="18"/>
-              </w:rPr>
-              <w:t>Aluminium / 铝</w:t>
-            </w:r>
-          </w:p>
-        </w:tc>
-        <w:tc>
-          <w:tcPr>
-            <w:tcW w:w="1000" w:type="dxa"/>
-            <w:tcMar>
-              <w:top w:w="30" w:type="dxa"/>
-              <w:left w:w="50" w:type="dxa"/>
-              <w:bottom w:w="30" w:type="dxa"/>
-              <w:right w:w="50" w:type="dxa"/>
-            </w:tcMar>
-          </w:tcPr>
-          <w:p/>
-        </w:tc>
-        <w:tc>
-          <w:tcPr>
-            <w:tcW w:w="2200" w:type="dxa"/>
-            <w:tcMar>
-              <w:top w:w="30" w:type="dxa"/>
-              <w:left w:w="50" w:type="dxa"/>
-              <w:bottom w:w="30" w:type="dxa"/>
-              <w:right w:w="50" w:type="dxa"/>
-            </w:tcMar>
-          </w:tcPr>
-          <w:p/>
-        </w:tc>
-        <w:tc>
-          <w:tcPr>
-            <w:tcW w:w="3955" w:type="dxa"/>
-            <w:tcMar>
-              <w:top w:w="30" w:type="dxa"/>
-              <w:left w:w="50" w:type="dxa"/>
-              <w:bottom w:w="30" w:type="dxa"/>
-              <w:right w:w="50" w:type="dxa"/>
-            </w:tcMar>
-          </w:tcPr>
-          <w:p/>
-        </w:tc>
-      </w:tr>
-      <w:tr>
-        <w:tblPrEx>
-          <w:tblBorders>
-            <w:top w:val="single" w:color="auto" w:sz="4" w:space="0"/>
-            <w:left w:val="single" w:color="auto" w:sz="4" w:space="0"/>
-            <w:bottom w:val="single" w:color="auto" w:sz="4" w:space="0"/>
-            <w:right w:val="single" w:color="auto" w:sz="4" w:space="0"/>
-            <w:insideH w:val="single" w:color="auto" w:sz="4" w:space="0"/>
-            <w:insideV w:val="single" w:color="auto" w:sz="4" w:space="0"/>
-          </w:tblBorders>
-          <w:tblCellMar>
-            <w:top w:w="0" w:type="dxa"/>
-            <w:left w:w="10" w:type="dxa"/>
-            <w:bottom w:w="0" w:type="dxa"/>
-            <w:right w:w="10" w:type="dxa"/>
-          </w:tblCellMar>
-        </w:tblPrEx>
-        <w:tc>
-          <w:tcPr>
-            <w:tcW w:w="2600" w:type="dxa"/>
-            <w:tcMar>
-              <w:top w:w="30" w:type="dxa"/>
-              <w:left w:w="50" w:type="dxa"/>
-              <w:bottom w:w="30" w:type="dxa"/>
-              <w:right w:w="50" w:type="dxa"/>
-            </w:tcMar>
-          </w:tcPr>
-          <w:p>
-            <w:r>
-              <w:rPr>
-                <w:rFonts w:ascii="Times New Roman" w:hAnsi="Times New Roman" w:eastAsia="Times New Roman" w:cs="Times New Roman"/>
-                <w:sz w:val="18"/>
-                <w:szCs w:val="18"/>
-              </w:rPr>
-              <w:t>Kunststoffe / 塑料</w:t>
-            </w:r>
-          </w:p>
-        </w:tc>
-        <w:tc>
-          <w:tcPr>
-            <w:tcW w:w="1000" w:type="dxa"/>
-            <w:tcMar>
-              <w:top w:w="30" w:type="dxa"/>
-              <w:left w:w="50" w:type="dxa"/>
-              <w:bottom w:w="30" w:type="dxa"/>
-              <w:right w:w="50" w:type="dxa"/>
-            </w:tcMar>
-          </w:tcPr>
-          <w:p/>
-        </w:tc>
-        <w:tc>
-          <w:tcPr>
-            <w:tcW w:w="2200" w:type="dxa"/>
-            <w:tcMar>
-              <w:top w:w="30" w:type="dxa"/>
-              <w:left w:w="50" w:type="dxa"/>
-              <w:bottom w:w="30" w:type="dxa"/>
-              <w:right w:w="50" w:type="dxa"/>
-            </w:tcMar>
-          </w:tcPr>
-          <w:p/>
-        </w:tc>
-        <w:tc>
-          <w:tcPr>
-            <w:tcW w:w="3955" w:type="dxa"/>
-            <w:tcMar>
-              <w:top w:w="30" w:type="dxa"/>
-              <w:left w:w="50" w:type="dxa"/>
-              <w:bottom w:w="30" w:type="dxa"/>
-              <w:right w:w="50" w:type="dxa"/>
-            </w:tcMar>
-          </w:tcPr>
-          <w:p/>
-        </w:tc>
-      </w:tr>
-      <w:tr>
-        <w:tblPrEx>
-          <w:tblBorders>
-            <w:top w:val="single" w:color="auto" w:sz="4" w:space="0"/>
-            <w:left w:val="single" w:color="auto" w:sz="4" w:space="0"/>
-            <w:bottom w:val="single" w:color="auto" w:sz="4" w:space="0"/>
-            <w:right w:val="single" w:color="auto" w:sz="4" w:space="0"/>
-            <w:insideH w:val="single" w:color="auto" w:sz="4" w:space="0"/>
-            <w:insideV w:val="single" w:color="auto" w:sz="4" w:space="0"/>
-          </w:tblBorders>
-          <w:tblCellMar>
-            <w:top w:w="0" w:type="dxa"/>
-            <w:left w:w="10" w:type="dxa"/>
-            <w:bottom w:w="0" w:type="dxa"/>
-            <w:right w:w="10" w:type="dxa"/>
-          </w:tblCellMar>
-        </w:tblPrEx>
-        <w:tc>
-          <w:tcPr>
-            <w:tcW w:w="2600" w:type="dxa"/>
-            <w:tcMar>
-              <w:top w:w="30" w:type="dxa"/>
-              <w:left w:w="50" w:type="dxa"/>
-              <w:bottom w:w="30" w:type="dxa"/>
-              <w:right w:w="50" w:type="dxa"/>
-            </w:tcMar>
-          </w:tcPr>
-          <w:p>
-            <w:r>
-              <w:rPr>
-                <w:rFonts w:ascii="Times New Roman" w:hAnsi="Times New Roman" w:eastAsia="Times New Roman" w:cs="Times New Roman"/>
-                <w:sz w:val="18"/>
-                <w:szCs w:val="18"/>
-              </w:rPr>
-              <w:t>Verbunde / 复合材料</w:t>
-            </w:r>
-          </w:p>
-        </w:tc>
-        <w:tc>
-          <w:tcPr>
-            <w:tcW w:w="1000" w:type="dxa"/>
-            <w:tcMar>
-              <w:top w:w="30" w:type="dxa"/>
-              <w:left w:w="50" w:type="dxa"/>
-              <w:bottom w:w="30" w:type="dxa"/>
-              <w:right w:w="50" w:type="dxa"/>
-            </w:tcMar>
-          </w:tcPr>
-          <w:p/>
-        </w:tc>
-        <w:tc>
-          <w:tcPr>
-            <w:tcW w:w="2200" w:type="dxa"/>
-            <w:tcMar>
-              <w:top w:w="30" w:type="dxa"/>
-              <w:left w:w="50" w:type="dxa"/>
-              <w:bottom w:w="30" w:type="dxa"/>
-              <w:right w:w="50" w:type="dxa"/>
-            </w:tcMar>
-          </w:tcPr>
-          <w:p/>
-        </w:tc>
-        <w:tc>
-          <w:tcPr>
-            <w:tcW w:w="3955" w:type="dxa"/>
-            <w:tcMar>
-              <w:top w:w="30" w:type="dxa"/>
-              <w:left w:w="50" w:type="dxa"/>
-              <w:bottom w:w="30" w:type="dxa"/>
-              <w:right w:w="50" w:type="dxa"/>
-            </w:tcMar>
-          </w:tcPr>
-          <w:p/>
-        </w:tc>
-      </w:tr>
-      <w:tr>
-        <w:tblPrEx>
-          <w:tblBorders>
-            <w:top w:val="single" w:color="auto" w:sz="4" w:space="0"/>
-            <w:left w:val="single" w:color="auto" w:sz="4" w:space="0"/>
-            <w:bottom w:val="single" w:color="auto" w:sz="4" w:space="0"/>
-            <w:right w:val="single" w:color="auto" w:sz="4" w:space="0"/>
-            <w:insideH w:val="single" w:color="auto" w:sz="4" w:space="0"/>
-            <w:insideV w:val="single" w:color="auto" w:sz="4" w:space="0"/>
-          </w:tblBorders>
-          <w:tblCellMar>
-            <w:top w:w="0" w:type="dxa"/>
-            <w:left w:w="10" w:type="dxa"/>
-            <w:bottom w:w="0" w:type="dxa"/>
-            <w:right w:w="10" w:type="dxa"/>
-          </w:tblCellMar>
-        </w:tblPrEx>
-        <w:tc>
-          <w:tcPr>
-            <w:tcW w:w="2600" w:type="dxa"/>
-            <w:tcMar>
-              <w:top w:w="30" w:type="dxa"/>
-              <w:left w:w="50" w:type="dxa"/>
-              <w:bottom w:w="30" w:type="dxa"/>
-              <w:right w:w="50" w:type="dxa"/>
-            </w:tcMar>
-          </w:tcPr>
-          <w:p>
-            <w:r>
-              <w:rPr>
-                <w:rFonts w:ascii="Times New Roman" w:hAnsi="Times New Roman" w:eastAsia="Times New Roman" w:cs="Times New Roman"/>
-                <w:sz w:val="18"/>
-                <w:szCs w:val="18"/>
-              </w:rPr>
-              <w:t>Getränkekarton / 饮料纸盒</w:t>
-            </w:r>
-          </w:p>
-        </w:tc>
-        <w:tc>
-          <w:tcPr>
-            <w:tcW w:w="1000" w:type="dxa"/>
-            <w:tcMar>
-              <w:top w:w="30" w:type="dxa"/>
-              <w:left w:w="50" w:type="dxa"/>
-              <w:bottom w:w="30" w:type="dxa"/>
-              <w:right w:w="50" w:type="dxa"/>
-            </w:tcMar>
-          </w:tcPr>
-          <w:p/>
-        </w:tc>
-        <w:tc>
-          <w:tcPr>
-            <w:tcW w:w="2200" w:type="dxa"/>
-            <w:tcMar>
-              <w:top w:w="30" w:type="dxa"/>
-              <w:left w:w="50" w:type="dxa"/>
-              <w:bottom w:w="30" w:type="dxa"/>
-              <w:right w:w="50" w:type="dxa"/>
-            </w:tcMar>
-          </w:tcPr>
-          <w:p/>
-        </w:tc>
-        <w:tc>
-          <w:tcPr>
-            <w:tcW w:w="3955" w:type="dxa"/>
-            <w:tcMar>
-              <w:top w:w="30" w:type="dxa"/>
-              <w:left w:w="50" w:type="dxa"/>
-              <w:bottom w:w="30" w:type="dxa"/>
-              <w:right w:w="50" w:type="dxa"/>
-            </w:tcMar>
-          </w:tcPr>
-          <w:p/>
-        </w:tc>
-      </w:tr>
-      <w:tr>
-        <w:tblPrEx>
-          <w:tblBorders>
-            <w:top w:val="single" w:color="auto" w:sz="4" w:space="0"/>
-            <w:left w:val="single" w:color="auto" w:sz="4" w:space="0"/>
-            <w:bottom w:val="single" w:color="auto" w:sz="4" w:space="0"/>
-            <w:right w:val="single" w:color="auto" w:sz="4" w:space="0"/>
-            <w:insideH w:val="single" w:color="auto" w:sz="4" w:space="0"/>
-            <w:insideV w:val="single" w:color="auto" w:sz="4" w:space="0"/>
-          </w:tblBorders>
-          <w:tblCellMar>
-            <w:top w:w="0" w:type="dxa"/>
-            <w:left w:w="10" w:type="dxa"/>
-            <w:bottom w:w="0" w:type="dxa"/>
-            <w:right w:w="10" w:type="dxa"/>
-          </w:tblCellMar>
-        </w:tblPrEx>
-        <w:tc>
-          <w:tcPr>
-            <w:tcW w:w="2600" w:type="dxa"/>
-            <w:tcMar>
-              <w:top w:w="30" w:type="dxa"/>
-              <w:left w:w="50" w:type="dxa"/>
-              <w:bottom w:w="30" w:type="dxa"/>
-              <w:right w:w="50" w:type="dxa"/>
-            </w:tcMar>
-          </w:tcPr>
-          <w:p>
-            <w:r>
-              <w:rPr>
-                <w:rFonts w:ascii="Times New Roman" w:hAnsi="Times New Roman" w:eastAsia="Times New Roman" w:cs="Times New Roman"/>
-                <w:sz w:val="18"/>
-                <w:szCs w:val="18"/>
-              </w:rPr>
-              <w:t>Sonstige / 其他</w:t>
+              <w:t>{packaging_items}</w:t>
             </w:r>
           </w:p>
         </w:tc>
@@ -9805,16 +9280,6 @@
                 <w:szCs w:val="21"/>
               </w:rPr>
               <w:t>Der Kunde bestätigt die Richtigkeit der vorstehenden Angaben nach bestem Wissen und Gewissen.</w:t>
-            </w:r>
-          </w:p>
-          <w:p>
-            <w:r>
-              <w:rPr>
-                <w:rFonts w:ascii="Times New Roman" w:hAnsi="Times New Roman" w:eastAsia="Times New Roman" w:cs="Times New Roman"/>
-                <w:sz w:val="21"/>
-                <w:szCs w:val="21"/>
-              </w:rPr>
-              <w:t>{packaging_items}</w:t>
             </w:r>
           </w:p>
         </w:tc>

</xml_diff>